<commit_message>
Restrict approver archive to assigned documents and apply security updates
- Approvers (staff and head) see only approved documents assigned to them, in any category
- Heads now have an archive
- User Accounts table shows email instead of username
- Update guzzle, commonmark, flysystem, and laravel/framework within Laravel 11 (fixes 18 of 22 advisories)
- Rewrite ML training samples and sample document uploads with new requesters and October 5-10, 2026 dates

Co-Authored-By: Claude Sonnet 5 <noreply@anthropic.com>
</commit_message>
<xml_diff>
--- a/database/sample_document_uploads/service_report_SR-2026-0001.docx
+++ b/database/sample_document_uploads/service_report_SR-2026-0001.docx
@@ -7,7 +7,7 @@
         <w:pStyle w:val="PreformattedText"/>
         <w:bidi w:val="0"/>
         <w:spacing w:before="0" w:after="0"/>
-        <w:jc w:val="start"/>
+        <w:jc w:val="left"/>
         <w:rPr/>
       </w:pPr>
       <w:r>
@@ -20,172 +20,107 @@
         <w:pStyle w:val="PreformattedText"/>
         <w:bidi w:val="0"/>
         <w:spacing w:before="0" w:after="0"/>
-        <w:jc w:val="start"/>
-        <w:rPr/>
-      </w:pPr>
-      <w:r>
-        <w:rPr/>
-      </w:r>
-    </w:p>
-    <w:p>
-      <w:pPr>
-        <w:pStyle w:val="PreformattedText"/>
-        <w:bidi w:val="0"/>
-        <w:spacing w:before="0" w:after="0"/>
-        <w:jc w:val="start"/>
-        <w:rPr/>
-      </w:pPr>
-      <w:r>
-        <w:rPr/>
-        <w:t>Technician assigned: Ferdinand Ilagan</w:t>
-      </w:r>
-    </w:p>
-    <w:p>
-      <w:pPr>
-        <w:pStyle w:val="PreformattedText"/>
-        <w:bidi w:val="0"/>
-        <w:spacing w:before="0" w:after="0"/>
-        <w:jc w:val="start"/>
-        <w:rPr/>
-      </w:pPr>
-      <w:r>
-        <w:rPr/>
-        <w:t>Date of service: June 24, 2026</w:t>
-      </w:r>
-    </w:p>
-    <w:p>
-      <w:pPr>
-        <w:pStyle w:val="PreformattedText"/>
-        <w:bidi w:val="0"/>
-        <w:spacing w:before="0" w:after="0"/>
-        <w:jc w:val="start"/>
-        <w:rPr/>
-      </w:pPr>
-      <w:r>
-        <w:rPr/>
-      </w:r>
-    </w:p>
-    <w:p>
-      <w:pPr>
-        <w:pStyle w:val="PreformattedText"/>
-        <w:bidi w:val="0"/>
-        <w:spacing w:before="0" w:after="0"/>
-        <w:jc w:val="start"/>
-        <w:rPr/>
-      </w:pPr>
-      <w:r>
-        <w:rPr/>
-        <w:t>This report covers the scheduled inspection and servicing of the standby</w:t>
-      </w:r>
-    </w:p>
-    <w:p>
-      <w:pPr>
-        <w:pStyle w:val="PreformattedText"/>
-        <w:bidi w:val="0"/>
-        <w:spacing w:before="0" w:after="0"/>
-        <w:jc w:val="start"/>
-        <w:rPr/>
-      </w:pPr>
-      <w:r>
-        <w:rPr/>
-        <w:t>fire pump in the basement utility room.</w:t>
-      </w:r>
-    </w:p>
-    <w:p>
-      <w:pPr>
-        <w:pStyle w:val="PreformattedText"/>
-        <w:bidi w:val="0"/>
-        <w:spacing w:before="0" w:after="0"/>
-        <w:jc w:val="start"/>
-        <w:rPr/>
-      </w:pPr>
-      <w:r>
-        <w:rPr/>
-      </w:r>
-    </w:p>
-    <w:p>
-      <w:pPr>
-        <w:pStyle w:val="PreformattedText"/>
-        <w:bidi w:val="0"/>
-        <w:spacing w:before="0" w:after="0"/>
-        <w:jc w:val="start"/>
-        <w:rPr/>
-      </w:pPr>
-      <w:r>
-        <w:rPr/>
-        <w:t>Findings: The pump started and ran successfully under test conditions,</w:t>
-      </w:r>
-    </w:p>
-    <w:p>
-      <w:pPr>
-        <w:pStyle w:val="PreformattedText"/>
-        <w:bidi w:val="0"/>
-        <w:spacing w:before="0" w:after="0"/>
-        <w:jc w:val="start"/>
-        <w:rPr/>
-      </w:pPr>
-      <w:r>
-        <w:rPr/>
-        <w:t>reaching rated pressure within the expected time window. The control panel</w:t>
-      </w:r>
-    </w:p>
-    <w:p>
-      <w:pPr>
-        <w:pStyle w:val="PreformattedText"/>
-        <w:bidi w:val="0"/>
-        <w:spacing w:before="0" w:after="0"/>
-        <w:jc w:val="start"/>
-        <w:rPr/>
-      </w:pPr>
-      <w:r>
-        <w:rPr/>
-        <w:t>battery was found near end of life and was replaced. All isolation valves</w:t>
-      </w:r>
-    </w:p>
-    <w:p>
-      <w:pPr>
-        <w:pStyle w:val="PreformattedText"/>
-        <w:bidi w:val="0"/>
-        <w:spacing w:before="0" w:after="0"/>
-        <w:jc w:val="start"/>
-        <w:rPr/>
-      </w:pPr>
-      <w:r>
-        <w:rPr/>
-        <w:t>were confirmed in their correct operating positions and re-tagged. No</w:t>
-      </w:r>
-    </w:p>
-    <w:p>
-      <w:pPr>
-        <w:pStyle w:val="PreformattedText"/>
-        <w:bidi w:val="0"/>
-        <w:spacing w:before="0" w:after="0"/>
-        <w:jc w:val="start"/>
-        <w:rPr/>
-      </w:pPr>
-      <w:r>
-        <w:rPr/>
-        <w:t>further issues were observed; next scheduled test is due in three months.</w:t>
-      </w:r>
-    </w:p>
-    <w:p>
-      <w:pPr>
-        <w:pStyle w:val="PreformattedText"/>
-        <w:bidi w:val="0"/>
-        <w:spacing w:before="0" w:after="0"/>
-        <w:jc w:val="start"/>
-        <w:rPr/>
-      </w:pPr>
-      <w:r>
-        <w:rPr/>
-      </w:r>
-    </w:p>
-    <w:p>
-      <w:pPr>
-        <w:pStyle w:val="PreformattedText"/>
-        <w:bidi w:val="0"/>
-        <w:spacing w:before="0" w:after="0"/>
-        <w:jc w:val="start"/>
+        <w:jc w:val="left"/>
+        <w:rPr/>
+      </w:pPr>
+      <w:r>
+        <w:rPr/>
+      </w:r>
+    </w:p>
+    <w:p>
+      <w:pPr>
+        <w:pStyle w:val="PreformattedText"/>
+        <w:bidi w:val="0"/>
+        <w:spacing w:before="0" w:after="0"/>
+        <w:jc w:val="left"/>
+        <w:rPr/>
+      </w:pPr>
+      <w:r>
+        <w:rPr/>
+        <w:t>Technician assigned: Christina Villa</w:t>
+      </w:r>
+    </w:p>
+    <w:p>
+      <w:pPr>
+        <w:pStyle w:val="PreformattedText"/>
+        <w:bidi w:val="0"/>
+        <w:spacing w:before="0" w:after="0"/>
+        <w:jc w:val="left"/>
+        <w:rPr/>
+      </w:pPr>
+      <w:r>
+        <w:rPr/>
+        <w:t>Date of service: October 7, 2026</w:t>
+      </w:r>
+    </w:p>
+    <w:p>
+      <w:pPr>
+        <w:pStyle w:val="PreformattedText"/>
+        <w:bidi w:val="0"/>
+        <w:spacing w:before="0" w:after="0"/>
+        <w:jc w:val="left"/>
+        <w:rPr/>
+      </w:pPr>
+      <w:r>
+        <w:rPr/>
+      </w:r>
+    </w:p>
+    <w:p>
+      <w:pPr>
+        <w:pStyle w:val="PreformattedText"/>
+        <w:bidi w:val="0"/>
+        <w:spacing w:before="0" w:after="0"/>
+        <w:jc w:val="left"/>
+        <w:rPr/>
+      </w:pPr>
+      <w:r>
+        <w:rPr/>
+        <w:t>This report covers the scheduled inspection and servicing of the main electrical panel in the ground-floor utility room.</w:t>
+      </w:r>
+    </w:p>
+    <w:p>
+      <w:pPr>
+        <w:pStyle w:val="PreformattedText"/>
+        <w:bidi w:val="0"/>
+        <w:spacing w:before="0" w:after="0"/>
+        <w:jc w:val="left"/>
+        <w:rPr/>
+      </w:pPr>
+      <w:r>
+        <w:rPr/>
+      </w:r>
+    </w:p>
+    <w:p>
+      <w:pPr>
+        <w:pStyle w:val="PreformattedText"/>
+        <w:bidi w:val="0"/>
+        <w:spacing w:before="0" w:after="0"/>
+        <w:jc w:val="left"/>
+        <w:rPr/>
+      </w:pPr>
+      <w:r>
+        <w:rPr/>
+        <w:t>Findings: All breakers were tested under load and operated within their rated limits. One cover screw was loose and was tightened. Thermal scan showed normal temperatures at every terminal. The panel's warning labels were faded and have been reprinted and reattached. No further issues were observed; next scheduled inspection is due in six months.</w:t>
+      </w:r>
+    </w:p>
+    <w:p>
+      <w:pPr>
+        <w:pStyle w:val="PreformattedText"/>
+        <w:bidi w:val="0"/>
+        <w:spacing w:before="0" w:after="0"/>
+        <w:jc w:val="left"/>
+        <w:rPr/>
+      </w:pPr>
+      <w:r>
+        <w:rPr/>
+      </w:r>
+    </w:p>
+    <w:p>
+      <w:pPr>
+        <w:pStyle w:val="PreformattedText"/>
+        <w:bidi w:val="0"/>
+        <w:spacing w:before="0" w:after="0"/>
+        <w:jc w:val="left"/>
         <w:rPr/>
       </w:pPr>
       <w:r>

</xml_diff>